<commit_message>
chore: repo hygiene - gitignore, untrack db files, remove stray file, scrub name
- Add root .gitignore (*.db, *.pyc, __pycache__/, .env, node_modules/, .DS_Store, *.log, venv artifacts)
- git rm --cached backend/telemetry.db and telemetry(old).db (kept on disk, untracked going forward)
- Remove timetable.html, an unrelated personal file accidentally committed to this repo
- Scrub the project lead's personal name from backend/Day4_Planning_System_Architecture.docx,
  replacing it with "the project lead" (surgical edit to word/document.xml only, verified
  zip/XML integrity and that every other part of the docx is byte-identical)

The same name is also baked into Internship/PDF/ELM327_TPMS_IoT_Internship_July1st.pdf as
flattened PDF text and cannot be cleanly edited; it is left as-is here pending a decision on
history rewrite / regenerating a clean copy.

Co-Authored-By: Claude Sonnet 5 <noreply@anthropic.com>
</commit_message>
<xml_diff>
--- a/backend/Day4_Planning_System_Architecture.docx
+++ b/backend/Day4_Planning_System_Architecture.docx
@@ -1719,7 +1719,7 @@
           <w:sz w:val="23"/>
           <w:szCs w:val="23"/>
         </w:rPr>
-        <w:t>3.7 New requirement from Juda</w:t>
+        <w:t>3.7 New requirement from the project lead</w:t>
       </w:r>
     </w:p>
     <w:p>
@@ -1737,7 +1737,7 @@
           <w:sz w:val="22"/>
           <w:szCs w:val="22"/>
         </w:rPr>
-        <w:t>Juda (project lead) has asked us to implement collision-avoidance algorithms for when the vehicle is moving over a distance. This sits on top of the Track B platform and has been added to Person E's research work (see Section 4).</w:t>
+        <w:t>The project lead has asked us to implement collision-avoidance algorithms for when the vehicle is moving over a distance. This sits on top of the Track B platform and has been added to Person E's research work (see Section 4).</w:t>
       </w:r>
     </w:p>
     <w:p>
@@ -1930,7 +1930,7 @@
               <w:rPr>
                 <w:rFonts w:eastAsia="Calibri"/>
               </w:rPr>
-              <w:t>Overall planning, sequencing, decisions, and getting sign-off from Juda.</w:t>
+              <w:t>Overall planning, sequencing, decisions, and getting sign-off from the project lead.</w:t>
             </w:r>
           </w:p>
         </w:tc>
@@ -2104,7 +2104,7 @@
               <w:rPr>
                 <w:rFonts w:eastAsia="Calibri"/>
               </w:rPr>
-              <w:t>Platform hardware / procurement - research and list all parts for the car we build. No buying until budget sign-off from Juda.</w:t>
+              <w:t>Platform hardware / procurement - research and list all parts for the car we build. No buying until budget sign-off from the project lead.</w:t>
             </w:r>
           </w:p>
         </w:tc>
@@ -2144,7 +2144,7 @@
               <w:rPr>
                 <w:rFonts w:eastAsia="Calibri"/>
               </w:rPr>
-              <w:t>Real-car sensing (ELM327 + TPMS hands-on) and researching the collision-avoidance algorithms Juda asked for.</w:t>
+              <w:t>Real-car sensing (ELM327 + TPMS hands-on) and researching the collision-avoidance algorithms the project lead asked for.</w:t>
             </w:r>
           </w:p>
         </w:tc>
@@ -2429,7 +2429,7 @@
           <w:sz w:val="22"/>
           <w:szCs w:val="22"/>
         </w:rPr>
-        <w:t>Get Juda's sign-off on the reframe (own platform for control) and on the parts budget before ordering anything.</w:t>
+        <w:t>Get the project lead's sign-off on the reframe (own platform for control) and on the parts budget before ordering anything.</w:t>
       </w:r>
     </w:p>
     <w:p>

</xml_diff>